<commit_message>
preparing for large traffic
</commit_message>
<xml_diff>
--- a/docs/Project-Defense-Document.docx
+++ b/docs/Project-Defense-Document.docx
@@ -189,7 +189,7 @@
         <w:rPr>
           <w:sz w:val="20"/>
         </w:rPr>
-        <w:t xml:space="preserve"> 669 passing, run with a zero-dependency runner — unit tests on business logic and full route-level integration tests.</w:t>
+        <w:t xml:space="preserve"> 738 passing, run with a zero-dependency runner — unit tests on business logic and full route-level integration tests (plus a real-Mongo integration suite that runs when a database is present).</w:t>
       </w:r>
     </w:p>
     <w:p>
@@ -364,7 +364,7 @@
         <w:rPr>
           <w:sz w:val="20"/>
         </w:rPr>
-        <w:t xml:space="preserve"> — one codebase serves all five portals (Super Admin, Bursar, Registrar, Teacher, Parent, Student) and the REST API. Server-rendered pages load fast, and route handlers give me clean API endpoints next to the pages that use them.</w:t>
+        <w:t xml:space="preserve"> — one codebase serves all six portals (Super Admin, Bursar, Registrar, Teacher, Parent, Student) and the REST API. Server-rendered pages load fast, and route handlers give me clean API endpoints next to the pages that use them.</w:t>
       </w:r>
     </w:p>
     <w:p>
@@ -580,7 +580,88 @@
         <w:rPr>
           <w:sz w:val="20"/>
         </w:rPr>
-        <w:t xml:space="preserve"> — 669 automated tests run without a test-framework install.</w:t>
+        <w:t xml:space="preserve"> — 738 automated tests run without a test-framework install.</w:t>
+      </w:r>
+    </w:p>
+    <w:p>
+      <w:pPr>
+        <w:spacing w:after="80" w:line="276" w:lineRule="auto"/>
+        <w:ind w:left="360"/>
+      </w:pPr>
+      <w:r>
+        <w:rPr>
+          <w:sz w:val="20"/>
+        </w:rPr>
+        <w:t xml:space="preserve">•  </w:t>
+      </w:r>
+      ,
+      <w:r>
+        <w:rPr>
+          <w:b/>
+          <w:sz w:val="20"/>
+        </w:rPr>
+        <w:t xml:space="preserve">zod</w:t>
+      </w:r>
+      ,
+      <w:r>
+        <w:rPr>
+          <w:sz w:val="20"/>
+        </w:rPr>
+        <w:t xml:space="preserve"> — schema validation on every body-accepting API route: first invalid field wins, with the same user-facing messages and check order as the hand-rolled validation it replaced (a per-route exception list is documented in src/lib/validation.js).</w:t>
+      </w:r>
+    </w:p>
+    <w:p>
+      <w:pPr>
+        <w:spacing w:after="80" w:line="276" w:lineRule="auto"/>
+        <w:ind w:left="360"/>
+      </w:pPr>
+      <w:r>
+        <w:rPr>
+          <w:sz w:val="20"/>
+        </w:rPr>
+        <w:t xml:space="preserve">•  </w:t>
+      </w:r>
+      ,
+      <w:r>
+        <w:rPr>
+          <w:b/>
+          <w:sz w:val="20"/>
+        </w:rPr>
+        <w:t xml:space="preserve">Cloudflare Turnstile</w:t>
+      </w:r>
+      ,
+      <w:r>
+        <w:rPr>
+          <w:sz w:val="20"/>
+        </w:rPr>
+        <w:t xml:space="preserve"> — optional bot protection on login and register (skip entirely when unconfigured; verified server-side via siteverify when TURNSTILE_SECRET_KEY is set).</w:t>
+      </w:r>
+    </w:p>
+    <w:p>
+      <w:pPr>
+        <w:spacing w:after="80" w:line="276" w:lineRule="auto"/>
+        <w:ind w:left="360"/>
+      </w:pPr>
+      <w:r>
+        <w:rPr>
+          <w:sz w:val="20"/>
+        </w:rPr>
+        <w:t xml:space="preserve">•  </w:t>
+      </w:r>
+      ,
+      <w:r>
+        <w:rPr>
+          <w:b/>
+          <w:sz w:val="20"/>
+        </w:rPr>
+        <w:t xml:space="preserve">redis client</w:t>
+      </w:r>
+      ,
+      <w:r>
+        <w:rPr>
+          <w:sz w:val="20"/>
+        </w:rPr>
+        <w:t xml:space="preserve"> — shared rate-limit buckets, 1-hour account lockouts, and the auth/dashboard/timetable caches; required in production.</w:t>
       </w:r>
     </w:p>
     <w:p>
@@ -618,7 +699,7 @@
           <w:rFonts w:ascii="Courier New" w:hAnsi="Courier New"/>
           <w:sz w:val="16"/>
         </w:rPr>
-        <w:t xml:space="preserve">        │  HTTPS / JWT cookie</w:t>
+        <w:t xml:space="preserve">        │  HTTPS / JWT cookie + CSP/HSTS/X-Frame-Options headers</w:t>
       </w:r>
     </w:p>
     <w:p>
@@ -761,7 +842,7 @@
           <w:rFonts w:ascii="Courier New" w:hAnsi="Courier New"/>
           <w:sz w:val="16"/>
         </w:rPr>
-        <w:t xml:space="preserve">        + Redis (planned: shared rate limits + caches)</w:t>
+        <w:t xml:space="preserve">        + Redis (required in prod: shared rate limits + caches)</w:t>
       </w:r>
     </w:p>
     <w:p>
@@ -774,7 +855,7 @@
           <w:rFonts w:ascii="Courier New" w:hAnsi="Courier New"/>
           <w:sz w:val="16"/>
         </w:rPr>
-        <w:t xml:space="preserve">        + background jobs (timetable conflict scan, deletion sweeper)</w:t>
+        <w:t xml:space="preserve">        + background jobs (conflict scan, deletion sweeper — RUN_JOBS gated)</w:t>
       </w:r>
     </w:p>
     <w:p>
@@ -2093,7 +2174,7 @@
         <w:rPr>
           <w:sz w:val="20"/>
         </w:rPr>
-        <w:t xml:space="preserve"> Zero extra dependencies, and the same runner drives both unit tests and route-level integration tests. Business reason: the test suite (669 tests) runs anywhere the code runs.</w:t>
+        <w:t xml:space="preserve"> Zero extra dependencies, and the same runner drives both unit tests and route-level integration tests. Business reason: the test suite (738 tests) runs anywhere the code runs.</w:t>
       </w:r>
     </w:p>
     <w:p>
@@ -2292,7 +2373,7 @@
         <w:rPr>
           <w:sz w:val="20"/>
         </w:rPr>
-        <w:t xml:space="preserve"> Every document carries schoolId, every query is school-scoped, and there are dedicated isolation tests proving one tenant can't touch another's rows.</w:t>
+        <w:t xml:space="preserve"> Every document carries schoolId, every query is school-scoped, and there are dedicated isolation tests proving one tenant can't touch another's rows. Beyond the convention, a fail-closed Mongoose plugin (applied to every tenant model) throws if any query ever runs without a schoolId filter — forgetting to scope is a crash in staging, not a leak in production. The few legitimately by-_id lookups go through an explicit bypassTenantScope() escape hatch.</w:t>
       </w:r>
     </w:p>
     <w:p>
@@ -2346,7 +2427,7 @@
         <w:rPr>
           <w:sz w:val="20"/>
         </w:rPr>
-        <w:t xml:space="preserve"> The login path — and the big three are already shipped: native bcrypt (compares off the main thread), Redis-backed rate limits (shared budgets across instances), and Redis caching of the auth snapshot (60s, tokenVersion-aware) and dashboard stats (45s). Next: a login queue for the worst case, then a load test against the real Mongo tier.</w:t>
+        <w:t xml:space="preserve"> The login path — and the big three are already shipped: native bcrypt (compares off the main thread), Redis-backed rate limits (shared budgets across instances), and Redis caching of the auth snapshot (60s, tokenVersion-aware) and dashboard stats (45s). The day-one hardening batch is shipped too: a 1-hour account lockout after 10 failed logins (checked before bcrypt, so locked accounts cost nothing), per-school rate buckets, a fail-closed tenant-scope plugin, security headers on every response (production CSP is strict — per-request nonces, no 'unsafe-inline' in script-src), zod validation on every body-accepting route, Cloudflare Turnstile bot protection, and /api/health/db for orchestrators. Next: a login queue for the worst case, then a load test against the real Mongo tier.</w:t>
       </w:r>
     </w:p>
     <w:p>
@@ -2454,7 +2535,7 @@
         <w:rPr>
           <w:sz w:val="20"/>
         </w:rPr>
-        <w:t xml:space="preserve"> 669 tests with node:test — unit tests on business logic and route-level integration tests against the real API handlers with a mocked session.</w:t>
+        <w:t xml:space="preserve"> 738 tests with node:test — unit tests on business logic and route-level integration tests against the real API handlers with a mocked session, plus a real-Mongo suite (tenant-scope plugin, password-hashing middleware) that runs whenever a database is present.</w:t>
       </w:r>
     </w:p>
     <w:p>
@@ -2670,7 +2751,7 @@
         <w:rPr>
           <w:sz w:val="20"/>
         </w:rPr>
-        <w:t xml:space="preserve"> Stateless JWTs mean horizontal scaling is already possible, and the three biggest bottlenecks are already fixed: native bcrypt (login compares no longer block the event loop), Redis-backed rate limits (one shared budget across all instances), and Redis caching of the hot reads — the auth snapshot (60s) and the dashboard stats (45s) — so the heaviest page is 1 cache GET instead of 10+ countDocuments. What remains is a login queue for the worst case and load-testing the real Mongo tier — the full measured plan is in the traffic audit.</w:t>
+        <w:t xml:space="preserve"> Stateless JWTs mean horizontal scaling is already possible, and the three biggest bottlenecks are already fixed: native bcrypt (login compares no longer block the event loop), Redis-backed rate limits (one shared budget across all instances), and Redis caching of the hot reads — the auth snapshot (60s), dashboard stats (45s) and the timetable (5 min) — so the heaviest pages are cache GETs instead of Mongo queries. Bot protection (Turnstile), a 1-hour lockout after 10 failed logins, per-school rate buckets and the fail-closed tenant plugin sit in front of it all, and REDIS_URL/DATA_ENC_KEY are required at boot so a misconfigured deploy fails loudly. What remains is a login queue for the worst case and load-testing the real Mongo tier — the full measured plan is in the traffic audit.</w:t>
       </w:r>
     </w:p>
     <w:p>
@@ -2795,7 +2876,7 @@
         <w:rPr>
           <w:sz w:val="20"/>
         </w:rPr>
-        <w:t xml:space="preserve"> Three steps are shipped — native bcrypt (compares off the main thread), Redis-backed rate limits (shared per-IP/account/school budgets), and Redis caching of the auth snapshot (60s) and dashboard stats (45s). Remaining: a login queue for the worst case and a load test against the real Mongo tier — all specified with code in EduTrack-Traffic-Audit.md.</w:t>
+        <w:t xml:space="preserve"> Shipped: native bcrypt, Redis-backed rate limits with a 1-hour account lockout, Redis caching (auth 60s, dashboard stats 45s, timetable 5 min), Turnstile bot protection, security headers, a fail-closed tenant plugin, and REDIS_URL/DATA_ENC_KEY required at boot. Remaining: a login queue for the worst case and a load test against the real Mongo tier — all specified with code in EduTrack-Traffic-Audit.md.</w:t>
       </w:r>
     </w:p>
     <w:p>
@@ -2916,6 +2997,315 @@
           <w:b/>
           <w:sz w:val="20"/>
         </w:rPr>
+        <w:t xml:space="preserve">Edge-compatibility regression guard (14 August 2026)</w:t>
+      </w:r>
+      ,
+      <w:r>
+        <w:rPr>
+          <w:sz w:val="20"/>
+        </w:rPr>
+        <w:t xml:space="preserve"> — new tests/instrumentation-edge-clean.test.js: asserts instrumentation.js contains no Node-only process.* API reference (code or prose — only process.env is allowed) and no require(, while still reading its guard-rail env vars and dynamically importing the shutdown module. Anyone reintroducing the process.on that caused the 83k-line warning flood fails the suite immediately. Instrumentation comments reworded to keep the invariant honest. Suite 738 → 742.</w:t>
+      </w:r>
+    </w:p>
+    <w:p>
+      <w:pPr>
+        <w:spacing w:after="80" w:line="276" w:lineRule="auto"/>
+        <w:ind w:left="360"/>
+      </w:pPr>
+      <w:r>
+        <w:rPr>
+          <w:sz w:val="20"/>
+        </w:rPr>
+        <w:t xml:space="preserve">•  </w:t>
+      </w:r>
+      ,
+      <w:r>
+        <w:rPr>
+          <w:b/>
+          <w:sz w:val="20"/>
+        </w:rPr>
+        <w:t xml:space="preserve">Silenced the dev request-log flood (14 August 2026)</w:t>
+      </w:r>
+      ,
+      <w:r>
+        <w:rPr>
+          <w:sz w:val="20"/>
+        </w:rPr>
+        <w:t xml:space="preserve"> — Next 16's dev server prints a line for EVERY request (GET /api/auth/me 200 in 25ms (next.js: 5ms, …)) — ~9,000 lines per k6 storm, on top of the (already fixed) Edge warning flood. Set logging: { incomingRequests: false } in next.config.mjs (native switch; the ignore: [/regex/] form is documented in the config comment for selective logging later). Verified: after a 60-s, 100-VU login storm (3,403 requests, 0 errors) the dev log totals </w:t>
+      </w:r>
+      ,
+      <w:r>
+        <w:rPr>
+          <w:b/>
+          <w:sz w:val="20"/>
+        </w:rPr>
+        <w:t xml:space="preserve">8 lines</w:t>
+      </w:r>
+      ,
+      <w:r>
+        <w:rPr>
+          <w:sz w:val="20"/>
+        </w:rPr>
+        <w:t xml:space="preserve"> (6-line startup banner + 2 npm notices); dev login throughput improved again to </w:t>
+      </w:r>
+      ,
+      <w:r>
+        <w:rPr>
+          <w:b/>
+          <w:sz w:val="20"/>
+        </w:rPr>
+        <w:t xml:space="preserve">56.7 logins/s</w:t>
+      </w:r>
+      ,
+      <w:r>
+        <w:rPr>
+          <w:sz w:val="20"/>
+        </w:rPr>
+        <w:t xml:space="preserve"> (was 35.4) once the per-request logging overhead was gone.</w:t>
+      </w:r>
+    </w:p>
+    <w:p>
+      <w:pPr>
+        <w:spacing w:after="80" w:line="276" w:lineRule="auto"/>
+        <w:ind w:left="360"/>
+      </w:pPr>
+      <w:r>
+        <w:rPr>
+          <w:sz w:val="20"/>
+        </w:rPr>
+        <w:t xml:space="preserve">•  </w:t>
+      </w:r>
+      ,
+      <w:r>
+        <w:rPr>
+          <w:b/>
+          <w:sz w:val="20"/>
+        </w:rPr>
+        <w:t xml:space="preserve">Silenced the dev Edge-runtime warning flood (14 August 2026)</w:t>
+      </w:r>
+      ,
+      <w:r>
+        <w:rPr>
+          <w:sz w:val="20"/>
+        </w:rPr>
+        <w:t xml:space="preserve"> — Next's dev server statically checks instrumentation.js against the Edge runtime, and its bare process.on("SIGTERM", …) made it re-emit "A Node.js API is used (process.on) … not supported in the Edge Runtime" on every compile — 83,000+ log lines during the k6 storm, drowning real errors. Moved the graceful-shutdown wiring into a Node-only module (src/lib/shutdown.js, wireShutdown()) that instrumentation dynamically imports only inside its NEXT_RUNTIME === "nodejs" branch, so the Edge bundle never contains process.on. Verified: after the fix the dev log stays at 2 lines under a 40-request burst (was 83,695 lines), login still 200 (scheduler + boot checks intact), 738/738 tests, lint clean, prod build green. Re-running the k6 storms showed the flood was costing real throughput: the login-only burst went 22.6 → </w:t>
+      </w:r>
+      ,
+      <w:r>
+        <w:rPr>
+          <w:b/>
+          <w:sz w:val="20"/>
+        </w:rPr>
+        <w:t xml:space="preserve">35.4 logins/s</w:t>
+      </w:r>
+      ,
+      <w:r>
+        <w:rPr>
+          <w:sz w:val="20"/>
+        </w:rPr>
+        <w:t xml:space="preserve"> (p95 5.05 → 3.08 s) and the full 155-VU storm went 15.9 → </w:t>
+      </w:r>
+      ,
+      <w:r>
+        <w:rPr>
+          <w:b/>
+          <w:sz w:val="20"/>
+        </w:rPr>
+        <w:t xml:space="preserve">34.6 req/s</w:t>
+      </w:r>
+      ,
+      <w:r>
+        <w:rPr>
+          <w:sz w:val="20"/>
+        </w:rPr>
+        <w:t xml:space="preserve"> (p95 8.35 → 2.14 s, 0% errors) — with the dev log still at 2 lines afterward. The prod build remains the capacity number (302 logins/s / 71 req/s); dev is now both quieter and ~2× faster.</w:t>
+      </w:r>
+    </w:p>
+    <w:p>
+      <w:pPr>
+        <w:spacing w:after="80" w:line="276" w:lineRule="auto"/>
+        <w:ind w:left="360"/>
+      </w:pPr>
+      <w:r>
+        <w:rPr>
+          <w:sz w:val="20"/>
+        </w:rPr>
+        <w:t xml:space="preserve">•  </w:t>
+      </w:r>
+      ,
+      <w:r>
+        <w:rPr>
+          <w:b/>
+          <w:sz w:val="20"/>
+        </w:rPr>
+        <w:t xml:space="preserve">Production-build k6 storm (14 August 2026)</w:t>
+      </w:r>
+      ,
+      <w:r>
+        <w:rPr>
+          <w:sz w:val="20"/>
+        </w:rPr>
+        <w:t xml:space="preserve"> — reran the k6 login storm against a real next build + next start (prod mode, strict nonce CSP, in-memory rate-limit fallback): login-only burst </w:t>
+      </w:r>
+      ,
+      <w:r>
+        <w:rPr>
+          <w:b/>
+          <w:sz w:val="20"/>
+        </w:rPr>
+        <w:t xml:space="preserve">302 logins/s at 100 VUs (p95 371 ms)</w:t>
+      </w:r>
+      ,
+      <w:r>
+        <w:rPr>
+          <w:sz w:val="20"/>
+        </w:rPr>
+        <w:t xml:space="preserve"> and a </w:t>
+      </w:r>
+      ,
+      <w:r>
+        <w:rPr>
+          <w:b/>
+          <w:sz w:val="20"/>
+        </w:rPr>
+        <w:t xml:space="preserve">sustained 296 logins/s at 200 VUs (p95 819 ms)</w:t>
+      </w:r>
+      ,
+      <w:r>
+        <w:rPr>
+          <w:sz w:val="20"/>
+        </w:rPr>
+        <w:t xml:space="preserve"> — the single-instance saturation point (~300 logins/s on this box). Full 08:00-shape storm (155 VUs): </w:t>
+      </w:r>
+      ,
+      <w:r>
+        <w:rPr>
+          <w:b/>
+          <w:sz w:val="20"/>
+        </w:rPr>
+        <w:t xml:space="preserve">71.1 req/s, 15,251 requests, 0.00% failures, p95 13.4 ms</w:t>
+      </w:r>
+      ,
+      <w:r>
+        <w:rPr>
+          <w:sz w:val="20"/>
+        </w:rPr>
+        <w:t xml:space="preserve">, all 6,102 checks green. A 200-login single-second burst (the true 08:00 wall) finished at p95 988 ms with 0 errors. Dev-mode comparison: the same login burst measured 22.6 logins/s (p95 5.05 s) — the prod build is ~13× faster and the only number that counts for capacity. Script gained K6_LOGIN_VUS so concurrency is env-overridable. Caveat (unchanged): demo store + bcrypt cost 4, so this is the app's prod-build ceiling without the real Mongo/cost-10 costs.</w:t>
+      </w:r>
+    </w:p>
+    <w:p>
+      <w:pPr>
+        <w:spacing w:after="80" w:line="276" w:lineRule="auto"/>
+        <w:ind w:left="360"/>
+      </w:pPr>
+      <w:r>
+        <w:rPr>
+          <w:sz w:val="20"/>
+        </w:rPr>
+        <w:t xml:space="preserve">•  </w:t>
+      </w:r>
+      ,
+      <w:r>
+        <w:rPr>
+          <w:b/>
+          <w:sz w:val="20"/>
+        </w:rPr>
+        <w:t xml:space="preserve">Nonce-based production CSP (14 August 2026)</w:t>
+      </w:r>
+      ,
+      <w:r>
+        <w:rPr>
+          <w:sz w:val="20"/>
+        </w:rPr>
+        <w:t xml:space="preserve"> — replaced the pragmatic 'unsafe-inline' script CSP with a strict per-request nonce policy: src/proxy.js now generates a fresh nonce for every response and forwards the same CSP on the request (Next 16 reads the nonce from the request's CSP header via getScriptNonceFromHeader and applies it to every inline flight script). Production script-src is now 'self' 'nonce-…' https://challenges.cloudflare.com with </w:t>
+      </w:r>
+      ,
+      <w:r>
+        <w:rPr>
+          <w:b/>
+          <w:sz w:val="20"/>
+        </w:rPr>
+        <w:t xml:space="preserve">zero 'unsafe-inline'</w:t>
+      </w:r>
+      ,
+      <w:r>
+        <w:rPr>
+          <w:sz w:val="20"/>
+        </w:rPr>
+        <w:t xml:space="preserve">; dev keeps the permissive shape. This required forcing dynamic rendering (export const dynamic = "force-dynamic" in the root layout) — static prerendering bakes the HTML once, so per-request nonces can never reach it (the exact reason Next's docs mandate dynamic rendering for nonce CSPs). Verified end-to-end on a real production build: every inline &lt;script&gt; carries the response's nonce, npm audit clean, and the app renders + hydrates with zero console violations under the strict policy. Suite 737 → 738.</w:t>
+      </w:r>
+    </w:p>
+    <w:p>
+      <w:pPr>
+        <w:spacing w:after="80" w:line="276" w:lineRule="auto"/>
+        <w:ind w:left="360"/>
+      </w:pPr>
+      <w:r>
+        <w:rPr>
+          <w:sz w:val="20"/>
+        </w:rPr>
+        <w:t xml:space="preserve">•  </w:t>
+      </w:r>
+      ,
+      <w:r>
+        <w:rPr>
+          <w:b/>
+          <w:sz w:val="20"/>
+        </w:rPr>
+        <w:t xml:space="preserve">zod validation sweep across the API (14 August 2026)</w:t>
+      </w:r>
+      ,
+      <w:r>
+        <w:rPr>
+          <w:sz w:val="20"/>
+        </w:rPr>
+        <w:t xml:space="preserve"> — extended the login/register schema pattern to every body-accepting route (users create/patch/reset/merge/quick-add/import/placeholders, scores, attendance, fees structures/payments/receipts/reminders, school status/reminder-templates, timetable entry + class alerts, change-password, digest, leads, newsletter) with each route's historical messages and check order preserved — including sequential-schema runs where the original checks interleaved with business logic (users POST, leads). Deliberate, documented exceptions: school PATCH (deeply conditional + interpolated messages), role re-roll (delegated to roles.js), notifications delete/read (tolerate empty lists by design), rename-arm/rollover (store-validated). Schema-level tests added for every conversion; suite 709 → 737.</w:t>
+      </w:r>
+    </w:p>
+    <w:p>
+      <w:pPr>
+        <w:spacing w:after="80" w:line="276" w:lineRule="auto"/>
+        <w:ind w:left="360"/>
+      </w:pPr>
+      <w:r>
+        <w:rPr>
+          <w:sz w:val="20"/>
+        </w:rPr>
+        <w:t xml:space="preserve">•  </w:t>
+      </w:r>
+      ,
+      <w:r>
+        <w:rPr>
+          <w:b/>
+          <w:sz w:val="20"/>
+        </w:rPr>
+        <w:t xml:space="preserve">Security + scale hardening batch (14 August 2026)</w:t>
+      </w:r>
+      ,
+      <w:r>
+        <w:rPr>
+          <w:sz w:val="20"/>
+        </w:rPr>
+        <w:t xml:space="preserve"> — fail-closed tenant-scope Mongoose plugin on every tenant model (unscoped queries throw; explicit bypass for by-_id/site-wide reads), which surfaced and fixed TWO latent prod bugs: Mongoose 9 dropped callback-style middleware (the User pre-save hash and Score pre-validate hooks would have crashed every real Mongo write), and mongo-store.createUser silently dropped schoolId/password/role/assignedClass. Also shipped: 1-hour account lockout after 10 failed logins (checked before bcrypt), security headers on every response (CSP dev/prod variants, HSTS, X-Frame-Options, nosniff, Referrer/Permissions policies), zod validation on login + register (same messages), 5-minute timetable cache, GET /api/health/db, REDIS_URL + DATA_ENC_KEY required in production (fail-fast boot), response-sanitization sweep (tokenVersion/passwordSet now stripped like the demo/Mongo shapes), and optional Cloudflare Turnstile on login + register. npm audit --production is at 0 vulnerabilities. Suite grew 669 → 707 (plus a real-Mongo suite that runs when a DB is present).</w:t>
+      </w:r>
+    </w:p>
+    <w:p>
+      <w:pPr>
+        <w:spacing w:after="80" w:line="276" w:lineRule="auto"/>
+        <w:ind w:left="360"/>
+      </w:pPr>
+      <w:r>
+        <w:rPr>
+          <w:sz w:val="20"/>
+        </w:rPr>
+        <w:t xml:space="preserve">•  </w:t>
+      </w:r>
+      ,
+      <w:r>
+        <w:rPr>
+          <w:b/>
+          <w:sz w:val="20"/>
+        </w:rPr>
         <w:t xml:space="preserve">Interview cheat-sheet appendix (14 August 2026)</w:t>
       </w:r>
       ,
@@ -3354,41 +3744,44 @@
           <w:b/>
           <w:sz w:val="20"/>
         </w:rPr>
-        <w:t xml:space="preserve">~1,000 req/s per instance</w:t>
-      </w:r>
-      ,
-      <w:r>
-        <w:rPr>
-          <w:sz w:val="20"/>
-        </w:rPr>
-        <w:t xml:space="preserve"> — the measured prod-build baseline (docs/scaling.md); ~700 req/s is the safer real-world figure.</w:t>
-      </w:r>
-    </w:p>
-    <w:p>
-      <w:pPr>
-        <w:spacing w:after="80" w:line="276" w:lineRule="auto"/>
-        <w:ind w:left="360"/>
-      </w:pPr>
-      <w:r>
-        <w:rPr>
-          <w:sz w:val="20"/>
-        </w:rPr>
-        <w:t xml:space="preserve">•  </w:t>
-      </w:r>
-      ,
-      <w:r>
-        <w:rPr>
-          <w:b/>
-          <w:sz w:val="20"/>
-        </w:rPr>
-        <w:t xml:space="preserve">55.8 logins/s</w:t>
-      </w:r>
-      ,
-      <w:r>
-        <w:rPr>
-          <w:sz w:val="20"/>
-        </w:rPr>
-        <w:t xml:space="preserve"> — measured this week with native bcrypt in demo mode; the audit projects </w:t>
+        <w:t xml:space="preserve">~300 logins/s/instance</w:t>
+      </w:r>
+      ,
+      <w:r>
+        <w:rPr>
+          <w:sz w:val="20"/>
+        </w:rPr>
+        <w:t xml:space="preserve"> — measured on the standalone prod build this week (demo store, bcrypt cost 4): </w:t>
+      </w:r>
+      ,
+      <w:r>
+        <w:rPr>
+          <w:b/>
+          <w:sz w:val="20"/>
+        </w:rPr>
+        <w:t xml:space="preserve">302 logins/s at 100 VUs with p95 371 ms</w:t>
+      </w:r>
+      ,
+      <w:r>
+        <w:rPr>
+          <w:sz w:val="20"/>
+        </w:rPr>
+        <w:t xml:space="preserve">, plateauing at </w:t>
+      </w:r>
+      ,
+      <w:r>
+        <w:rPr>
+          <w:b/>
+          <w:sz w:val="20"/>
+        </w:rPr>
+        <w:t xml:space="preserve">296 logins/s under 200 VUs (p95 819 ms)</w:t>
+      </w:r>
+      ,
+      <w:r>
+        <w:rPr>
+          <w:sz w:val="20"/>
+        </w:rPr>
+        <w:t xml:space="preserve"> — the saturation point. The audit projects </w:t>
       </w:r>
       ,
       <w:r>
@@ -3403,7 +3796,7 @@
         <w:rPr>
           <w:sz w:val="20"/>
         </w:rPr>
-        <w:t xml:space="preserve"> on a real build, vs the old bcryptjs cliff of </w:t>
+        <w:t xml:space="preserve"> on a real build with cost-10 bcrypt + Mongo (vs the old bcryptjs cliff of </w:t>
       </w:r>
       ,
       <w:r>
@@ -3418,27 +3811,69 @@
         <w:rPr>
           <w:sz w:val="20"/>
         </w:rPr>
-        <w:t xml:space="preserve">.</w:t>
-      </w:r>
-    </w:p>
-    <w:p>
-      <w:pPr>
-        <w:spacing w:after="80" w:line="276" w:lineRule="auto"/>
-        <w:ind w:left="360"/>
-      </w:pPr>
-      <w:r>
-        <w:rPr>
-          <w:sz w:val="20"/>
-        </w:rPr>
-        <w:t xml:space="preserve">•  </w:t>
-      </w:r>
-      ,
-      <w:r>
-        <w:rPr>
-          <w:b/>
-          <w:sz w:val="20"/>
-        </w:rPr>
-        <w:t xml:space="preserve">669 automated tests, all passing</w:t>
+        <w:t xml:space="preserve">).</w:t>
+      </w:r>
+    </w:p>
+    <w:p>
+      <w:pPr>
+        <w:spacing w:after="80" w:line="276" w:lineRule="auto"/>
+        <w:ind w:left="360"/>
+      </w:pPr>
+      <w:r>
+        <w:rPr>
+          <w:sz w:val="20"/>
+        </w:rPr>
+        <w:t xml:space="preserve">•  </w:t>
+      </w:r>
+      ,
+      <w:r>
+        <w:rPr>
+          <w:b/>
+          <w:sz w:val="20"/>
+        </w:rPr>
+        <w:t xml:space="preserve">71 req/s mixed storm</w:t>
+      </w:r>
+      ,
+      <w:r>
+        <w:rPr>
+          <w:sz w:val="20"/>
+        </w:rPr>
+        <w:t xml:space="preserve"> — the 08:00-shape run (155 VUs: 15 logins / 135 session revalidations / 5 notification pollers, 3.5 min): </w:t>
+      </w:r>
+      ,
+      <w:r>
+        <w:rPr>
+          <w:b/>
+          <w:sz w:val="20"/>
+        </w:rPr>
+        <w:t xml:space="preserve">15,251 requests, 0 failures, p95 13 ms</w:t>
+      </w:r>
+      ,
+      <w:r>
+        <w:rPr>
+          <w:sz w:val="20"/>
+        </w:rPr>
+        <w:t xml:space="preserve">, every check passed. The same storm on the dev server managed 15.9 req/s — the prod build is the only number that counts.</w:t>
+      </w:r>
+    </w:p>
+    <w:p>
+      <w:pPr>
+        <w:spacing w:after="80" w:line="276" w:lineRule="auto"/>
+        <w:ind w:left="360"/>
+      </w:pPr>
+      <w:r>
+        <w:rPr>
+          <w:sz w:val="20"/>
+        </w:rPr>
+        <w:t xml:space="preserve">•  </w:t>
+      </w:r>
+      ,
+      <w:r>
+        <w:rPr>
+          <w:b/>
+          <w:sz w:val="20"/>
+        </w:rPr>
+        <w:t xml:space="preserve">738 automated tests, all passing</w:t>
       </w:r>
       ,
       <w:r>

</xml_diff>